<commit_message>
test(corpus): the list level cases of #293's comment, and a right-aligned Normal
- E-list-level-linked-no-level: a style that gives level 9, past the last
  of nine levels, and a style that inherits level 0 through w:basedOn, each
  named by level 2 of a list of its own (#293's comment).
- E-list-level-linked-defaults: the document defaults give level 0, a style
  gives a list but no level, and level 2 names the style.
- E-table-style-defaults-size-right-14: Normal right-aligned in mode 14, the
  control for [MS-DOCX] 2.3.1, which exempts only left.

The test now also pins the conditional formats' colours, the floating
tables' width, no level overrides in E-list-label-height, no direct
formatting in the cells of E-table-style-defaults-size, and the schema order
of table borders and cell margins.
</commit_message>
<xml_diff>
--- a/tests/corpus/word-rules/E-list-level-linked-no-level.docx
+++ b/tests/corpus/word-rules/E-list-level-linked-no-level.docx
@@ -16,6 +16,22 @@
       </w:pPr>
       <w:r>
         <w:t xml:space="preserve">Case 02: a second paragraph in the same style</w:t>
+      </w:r>
+    </w:p>
+    <w:p>
+      <w:pPr>
+        <w:pStyle w:val="LinkedLevel9"/>
+      </w:pPr>
+      <w:r>
+        <w:t xml:space="preserve">Case 03: the style LinkedLevel9 gives instance 2 and level 9, past the last of its nine levels; level 2 names the style</w:t>
+      </w:r>
+    </w:p>
+    <w:p>
+      <w:pPr>
+        <w:pStyle w:val="LinkedBasedOn"/>
+      </w:pPr>
+      <w:r>
+        <w:t xml:space="preserve">Case 04: the style LinkedBasedOn writes nothing and is based on LinkedBase, which gives instance 3 and level 0; level 2 names LinkedBasedOn</w:t>
       </w:r>
     </w:p>
     <w:sectPr>
@@ -62,8 +78,132 @@
       </w:pPr>
     </w:lvl>
   </w:abstractNum>
+  <w:abstractNum w:abstractNumId="1">
+    <w:nsid w:val="5C3A0032"/>
+    <w:multiLevelType w:val="multilevel"/>
+    <w:lvl w:ilvl="0">
+      <w:start w:val="1"/>
+      <w:numFmt w:val="lowerRoman"/>
+      <w:lvlText w:val="L0-%1"/>
+      <w:lvlJc w:val="left"/>
+      <w:pPr>
+        <w:ind w:left="720" w:hanging="360"/>
+      </w:pPr>
+    </w:lvl>
+    <w:lvl w:ilvl="1">
+      <w:start w:val="1"/>
+      <w:numFmt w:val="lowerRoman"/>
+      <w:lvlText w:val="L1-%2"/>
+      <w:lvlJc w:val="left"/>
+      <w:pPr>
+        <w:ind w:left="1440" w:hanging="360"/>
+      </w:pPr>
+    </w:lvl>
+    <w:lvl w:ilvl="2">
+      <w:start w:val="1"/>
+      <w:numFmt w:val="lowerRoman"/>
+      <w:pStyle w:val="LinkedLevel9"/>
+      <w:lvlText w:val="L2-%3"/>
+      <w:lvlJc w:val="left"/>
+      <w:pPr>
+        <w:ind w:left="2160" w:hanging="360"/>
+      </w:pPr>
+    </w:lvl>
+    <w:lvl w:ilvl="3">
+      <w:start w:val="1"/>
+      <w:numFmt w:val="lowerRoman"/>
+      <w:lvlText w:val="L3-%4"/>
+      <w:lvlJc w:val="left"/>
+      <w:pPr>
+        <w:ind w:left="2880" w:hanging="360"/>
+      </w:pPr>
+    </w:lvl>
+    <w:lvl w:ilvl="4">
+      <w:start w:val="1"/>
+      <w:numFmt w:val="lowerRoman"/>
+      <w:lvlText w:val="L4-%5"/>
+      <w:lvlJc w:val="left"/>
+      <w:pPr>
+        <w:ind w:left="3600" w:hanging="360"/>
+      </w:pPr>
+    </w:lvl>
+    <w:lvl w:ilvl="5">
+      <w:start w:val="1"/>
+      <w:numFmt w:val="lowerRoman"/>
+      <w:lvlText w:val="L5-%6"/>
+      <w:lvlJc w:val="left"/>
+      <w:pPr>
+        <w:ind w:left="4320" w:hanging="360"/>
+      </w:pPr>
+    </w:lvl>
+    <w:lvl w:ilvl="6">
+      <w:start w:val="1"/>
+      <w:numFmt w:val="lowerRoman"/>
+      <w:lvlText w:val="L6-%7"/>
+      <w:lvlJc w:val="left"/>
+      <w:pPr>
+        <w:ind w:left="5040" w:hanging="360"/>
+      </w:pPr>
+    </w:lvl>
+    <w:lvl w:ilvl="7">
+      <w:start w:val="1"/>
+      <w:numFmt w:val="lowerRoman"/>
+      <w:lvlText w:val="L7-%8"/>
+      <w:lvlJc w:val="left"/>
+      <w:pPr>
+        <w:ind w:left="5760" w:hanging="360"/>
+      </w:pPr>
+    </w:lvl>
+    <w:lvl w:ilvl="8">
+      <w:start w:val="1"/>
+      <w:numFmt w:val="lowerRoman"/>
+      <w:lvlText w:val="L8-%9"/>
+      <w:lvlJc w:val="left"/>
+      <w:pPr>
+        <w:ind w:left="6480" w:hanging="360"/>
+      </w:pPr>
+    </w:lvl>
+  </w:abstractNum>
+  <w:abstractNum w:abstractNumId="2">
+    <w:nsid w:val="5C3A0033"/>
+    <w:multiLevelType w:val="multilevel"/>
+    <w:lvl w:ilvl="0">
+      <w:start w:val="1"/>
+      <w:numFmt w:val="upperLetter"/>
+      <w:lvlText w:val="%1)"/>
+      <w:lvlJc w:val="left"/>
+      <w:pPr>
+        <w:ind w:left="720" w:hanging="360"/>
+      </w:pPr>
+    </w:lvl>
+    <w:lvl w:ilvl="1">
+      <w:start w:val="1"/>
+      <w:numFmt w:val="upperLetter"/>
+      <w:lvlText w:val="(%2)"/>
+      <w:lvlJc w:val="left"/>
+      <w:pPr>
+        <w:ind w:left="1440" w:hanging="360"/>
+      </w:pPr>
+    </w:lvl>
+    <w:lvl w:ilvl="2">
+      <w:start w:val="1"/>
+      <w:numFmt w:val="upperLetter"/>
+      <w:pStyle w:val="LinkedBasedOn"/>
+      <w:lvlText w:val="[%3]"/>
+      <w:lvlJc w:val="left"/>
+      <w:pPr>
+        <w:ind w:left="2160" w:hanging="360"/>
+      </w:pPr>
+    </w:lvl>
+  </w:abstractNum>
   <w:num w:numId="1">
     <w:abstractNumId w:val="0"/>
+  </w:num>
+  <w:num w:numId="2">
+    <w:abstractNumId w:val="1"/>
+  </w:num>
+  <w:num w:numId="3">
+    <w:abstractNumId w:val="2"/>
   </w:num>
 </w:numbering>
 </file>
@@ -126,5 +266,29 @@
       </w:numPr>
     </w:pPr>
   </w:style>
+  <w:style w:type="paragraph" w:customStyle="1" w:styleId="LinkedLevel9">
+    <w:name w:val="LinkedLevel9"/>
+    <w:basedOn w:val="Normal"/>
+    <w:pPr>
+      <w:numPr>
+        <w:ilvl w:val="9"/>
+        <w:numId w:val="2"/>
+      </w:numPr>
+    </w:pPr>
+  </w:style>
+  <w:style w:type="paragraph" w:customStyle="1" w:styleId="LinkedBase">
+    <w:name w:val="LinkedBase"/>
+    <w:basedOn w:val="Normal"/>
+    <w:pPr>
+      <w:numPr>
+        <w:ilvl w:val="0"/>
+        <w:numId w:val="3"/>
+      </w:numPr>
+    </w:pPr>
+  </w:style>
+  <w:style w:type="paragraph" w:customStyle="1" w:styleId="LinkedBasedOn">
+    <w:name w:val="LinkedBasedOn"/>
+    <w:basedOn w:val="LinkedBase"/>
+  </w:style>
 </w:styles>
 </file>
</xml_diff>